<commit_message>
docs: update report, ppt, and task 4 implementation
</commit_message>
<xml_diff>
--- a/Coputer vision report .docx
+++ b/Coputer vision report .docx
@@ -1523,14 +1523,12 @@
         </w:rPr>
         <w:t xml:space="preserve"> especially areas </w:t>
       </w:r>
-      <w:proofErr w:type="gramStart"/>
-      <w:r>
-        <w:rPr>
-          <w:rFonts w:ascii="Times New Roman" w:hAnsi="Times New Roman" w:cs="Times New Roman"/>
-        </w:rPr>
-        <w:t>with  complex</w:t>
-      </w:r>
-      <w:proofErr w:type="gramEnd"/>
+      <w:r>
+        <w:rPr>
+          <w:rFonts w:ascii="Times New Roman" w:hAnsi="Times New Roman" w:cs="Times New Roman"/>
+        </w:rPr>
+        <w:t>with complex</w:t>
+      </w:r>
       <w:r>
         <w:rPr>
           <w:rFonts w:ascii="Times New Roman" w:hAnsi="Times New Roman" w:cs="Times New Roman"/>
@@ -1651,19 +1649,31 @@
         </w:rPr>
         <w:t xml:space="preserve">The improvements in image clarity after deblurring can positively impact object detection performance clear edges and reduced blur can help detection models better localize objects and improve confidence </w:t>
       </w:r>
+      <w:r>
+        <w:rPr>
+          <w:rFonts w:ascii="Times New Roman" w:hAnsi="Times New Roman" w:cs="Times New Roman"/>
+        </w:rPr>
+        <w:t xml:space="preserve">scores. </w:t>
+      </w:r>
       <w:proofErr w:type="gramStart"/>
       <w:r>
         <w:rPr>
           <w:rFonts w:ascii="Times New Roman" w:hAnsi="Times New Roman" w:cs="Times New Roman"/>
         </w:rPr>
-        <w:t>scores .However</w:t>
+        <w:t>However</w:t>
+      </w:r>
+      <w:r>
+        <w:rPr>
+          <w:rFonts w:ascii="Times New Roman" w:hAnsi="Times New Roman" w:cs="Times New Roman"/>
+        </w:rPr>
+        <w:t xml:space="preserve">  the</w:t>
       </w:r>
       <w:proofErr w:type="gramEnd"/>
       <w:r>
         <w:rPr>
           <w:rFonts w:ascii="Times New Roman" w:hAnsi="Times New Roman" w:cs="Times New Roman"/>
         </w:rPr>
-        <w:t xml:space="preserve">  the presence of smoothing and artifacts may still limit detection accuracy in certain cases. </w:t>
+        <w:t xml:space="preserve"> presence of smoothing and artifacts may still limit detection accuracy in certain cases. </w:t>
       </w:r>
       <w:proofErr w:type="gramStart"/>
       <w:r>
@@ -1721,14 +1731,12 @@
         </w:rPr>
         <w:t xml:space="preserve"> it does not </w:t>
       </w:r>
-      <w:proofErr w:type="gramStart"/>
-      <w:r>
-        <w:rPr>
-          <w:rFonts w:ascii="Times New Roman" w:hAnsi="Times New Roman" w:cs="Times New Roman"/>
-        </w:rPr>
-        <w:t>completely  match</w:t>
-      </w:r>
-      <w:proofErr w:type="gramEnd"/>
+      <w:r>
+        <w:rPr>
+          <w:rFonts w:ascii="Times New Roman" w:hAnsi="Times New Roman" w:cs="Times New Roman"/>
+        </w:rPr>
+        <w:t>completely match</w:t>
+      </w:r>
       <w:r>
         <w:rPr>
           <w:rFonts w:ascii="Times New Roman" w:hAnsi="Times New Roman" w:cs="Times New Roman"/>

</xml_diff>

<commit_message>
final: updated report, ppt, and analysis with SSIM and detection results
</commit_message>
<xml_diff>
--- a/Coputer vision report .docx
+++ b/Coputer vision report .docx
@@ -2,30 +2,297 @@
 <file path=word/document.xml><?xml version="1.0" encoding="utf-8"?>
 <w:document xmlns:wpc="http://schemas.microsoft.com/office/word/2010/wordprocessingCanvas" xmlns:cx="http://schemas.microsoft.com/office/drawing/2014/chartex" xmlns:cx1="http://schemas.microsoft.com/office/drawing/2015/9/8/chartex" xmlns:cx2="http://schemas.microsoft.com/office/drawing/2015/10/21/chartex" xmlns:cx3="http://schemas.microsoft.com/office/drawing/2016/5/9/chartex" xmlns:cx4="http://schemas.microsoft.com/office/drawing/2016/5/10/chartex" xmlns:cx5="http://schemas.microsoft.com/office/drawing/2016/5/11/chartex" xmlns:cx6="http://schemas.microsoft.com/office/drawing/2016/5/12/chartex" xmlns:cx7="http://schemas.microsoft.com/office/drawing/2016/5/13/chartex" xmlns:cx8="http://schemas.microsoft.com/office/drawing/2016/5/14/chartex" xmlns:mc="http://schemas.openxmlformats.org/markup-compatibility/2006" xmlns:aink="http://schemas.microsoft.com/office/drawing/2016/ink" xmlns:am3d="http://schemas.microsoft.com/office/drawing/2017/model3d" xmlns:o="urn:schemas-microsoft-com:office:office" xmlns:oel="http://schemas.microsoft.com/office/2019/extlst" xmlns:r="http://schemas.openxmlformats.org/officeDocument/2006/relationships" xmlns:m="http://schemas.openxmlformats.org/officeDocument/2006/math" xmlns:v="urn:schemas-microsoft-com:vml" xmlns:wp14="http://schemas.microsoft.com/office/word/2010/wordprocessingDrawing" xmlns:wp="http://schemas.openxmlformats.org/drawingml/2006/wordprocessingDrawing" xmlns:w10="urn:schemas-microsoft-com:office:word" xmlns:w="http://schemas.openxmlformats.org/wordprocessingml/2006/main" xmlns:w14="http://schemas.microsoft.com/office/word/2010/wordml" xmlns:w15="http://schemas.microsoft.com/office/word/2012/wordml" xmlns:w16cex="http://schemas.microsoft.com/office/word/2018/wordml/cex" xmlns:w16cid="http://schemas.microsoft.com/office/word/2016/wordml/cid" xmlns:w16="http://schemas.microsoft.com/office/word/2018/wordml" xmlns:w16du="http://schemas.microsoft.com/office/word/2023/wordml/word16du" xmlns:w16sdtdh="http://schemas.microsoft.com/office/word/2020/wordml/sdtdatahash" xmlns:w16sdtfl="http://schemas.microsoft.com/office/word/2024/wordml/sdtformatlock" xmlns:w16se="http://schemas.microsoft.com/office/word/2015/wordml/symex" xmlns:wpg="http://schemas.microsoft.com/office/word/2010/wordprocessingGroup" xmlns:wpi="http://schemas.microsoft.com/office/word/2010/wordprocessingInk" xmlns:wne="http://schemas.microsoft.com/office/word/2006/wordml" xmlns:wps="http://schemas.microsoft.com/office/word/2010/wordprocessingShape" mc:Ignorable="w14 w15 w16se w16cid w16 w16cex w16sdtdh w16sdtfl w16du wp14">
   <w:body>
+    <w:p>
+      <w:r>
+        <w:rPr>
+          <w:rFonts w:ascii="Times New Roman" w:hAnsi="Times New Roman" w:cs="Times New Roman"/>
+          <w:b/>
+          <w:bCs/>
+          <w:noProof/>
+          <w:sz w:val="48"/>
+          <w:szCs w:val="48"/>
+        </w:rPr>
+        <w:drawing>
+          <wp:inline distT="0" distB="0" distL="0" distR="0" wp14:anchorId="6FA5FE67" wp14:editId="2BB5F3E2">
+            <wp:extent cx="5943600" cy="1461135"/>
+            <wp:effectExtent l="0" t="0" r="0" b="5715"/>
+            <wp:docPr id="231772918" name="Picture 1"/>
+            <wp:cNvGraphicFramePr>
+              <a:graphicFrameLocks xmlns:a="http://schemas.openxmlformats.org/drawingml/2006/main" noChangeAspect="1"/>
+            </wp:cNvGraphicFramePr>
+            <a:graphic xmlns:a="http://schemas.openxmlformats.org/drawingml/2006/main">
+              <a:graphicData uri="http://schemas.openxmlformats.org/drawingml/2006/picture">
+                <pic:pic xmlns:pic="http://schemas.openxmlformats.org/drawingml/2006/picture">
+                  <pic:nvPicPr>
+                    <pic:cNvPr id="231772918" name="Picture 231772918"/>
+                    <pic:cNvPicPr/>
+                  </pic:nvPicPr>
+                  <pic:blipFill>
+                    <a:blip r:embed="rId6" cstate="print">
+                      <a:extLst>
+                        <a:ext uri="{28A0092B-C50C-407E-A947-70E740481C1C}">
+                          <a14:useLocalDpi xmlns:a14="http://schemas.microsoft.com/office/drawing/2010/main" val="0"/>
+                        </a:ext>
+                      </a:extLst>
+                    </a:blip>
+                    <a:stretch>
+                      <a:fillRect/>
+                    </a:stretch>
+                  </pic:blipFill>
+                  <pic:spPr>
+                    <a:xfrm>
+                      <a:off x="0" y="0"/>
+                      <a:ext cx="5943600" cy="1461135"/>
+                    </a:xfrm>
+                    <a:prstGeom prst="rect">
+                      <a:avLst/>
+                    </a:prstGeom>
+                  </pic:spPr>
+                </pic:pic>
+              </a:graphicData>
+            </a:graphic>
+          </wp:inline>
+        </w:drawing>
+      </w:r>
+    </w:p>
+    <w:p/>
+    <w:p/>
+    <w:p>
+      <w:pPr>
+        <w:jc w:val="center"/>
+        <w:rPr>
+          <w:rFonts w:ascii="Times New Roman" w:hAnsi="Times New Roman" w:cs="Times New Roman"/>
+          <w:b/>
+          <w:bCs/>
+          <w:sz w:val="48"/>
+          <w:szCs w:val="48"/>
+        </w:rPr>
+      </w:pPr>
+      <w:r>
+        <w:rPr>
+          <w:rFonts w:ascii="Times New Roman" w:hAnsi="Times New Roman" w:cs="Times New Roman"/>
+          <w:b/>
+          <w:bCs/>
+          <w:sz w:val="48"/>
+          <w:szCs w:val="48"/>
+        </w:rPr>
+        <w:t>COMP6001</w:t>
+      </w:r>
+      <w:r>
+        <w:rPr>
+          <w:rFonts w:ascii="Times New Roman" w:hAnsi="Times New Roman" w:cs="Times New Roman"/>
+          <w:b/>
+          <w:bCs/>
+          <w:sz w:val="48"/>
+          <w:szCs w:val="48"/>
+        </w:rPr>
+        <w:t>-</w:t>
+      </w:r>
+      <w:r>
+        <w:rPr>
+          <w:rFonts w:ascii="Times New Roman" w:hAnsi="Times New Roman" w:cs="Times New Roman"/>
+          <w:b/>
+          <w:bCs/>
+          <w:sz w:val="48"/>
+          <w:szCs w:val="48"/>
+        </w:rPr>
+        <w:t xml:space="preserve">Computer Vision and Multimodal Machine Learning  </w:t>
+      </w:r>
+    </w:p>
+    <w:p>
+      <w:pPr>
+        <w:jc w:val="center"/>
+        <w:rPr>
+          <w:rFonts w:ascii="Times New Roman" w:hAnsi="Times New Roman" w:cs="Times New Roman"/>
+          <w:b/>
+          <w:bCs/>
+          <w:sz w:val="48"/>
+          <w:szCs w:val="48"/>
+        </w:rPr>
+      </w:pPr>
+      <w:r>
+        <w:rPr>
+          <w:rFonts w:ascii="Times New Roman" w:hAnsi="Times New Roman" w:cs="Times New Roman"/>
+          <w:b/>
+          <w:bCs/>
+          <w:sz w:val="48"/>
+          <w:szCs w:val="48"/>
+        </w:rPr>
+        <w:t>Assignment- 01</w:t>
+      </w:r>
+    </w:p>
     <w:p/>
     <w:p/>
     <w:p/>
-    <w:p/>
-    <w:p/>
-    <w:p/>
-    <w:p/>
-    <w:p/>
-    <w:p/>
-    <w:p/>
-    <w:p/>
-    <w:p/>
-    <w:p/>
-    <w:p/>
-    <w:p/>
-    <w:p/>
-    <w:p/>
-    <w:p/>
-    <w:p/>
-    <w:p/>
-    <w:p/>
-    <w:p/>
-    <w:p/>
-    <w:p/>
+    <w:p>
+      <w:pPr>
+        <w:rPr>
+          <w:rFonts w:ascii="Times New Roman" w:hAnsi="Times New Roman" w:cs="Times New Roman"/>
+          <w:sz w:val="48"/>
+          <w:szCs w:val="48"/>
+        </w:rPr>
+      </w:pPr>
+      <w:r>
+        <w:rPr>
+          <w:rFonts w:ascii="Times New Roman" w:hAnsi="Times New Roman" w:cs="Times New Roman"/>
+          <w:b/>
+          <w:bCs/>
+          <w:sz w:val="48"/>
+          <w:szCs w:val="48"/>
+        </w:rPr>
+        <w:t xml:space="preserve">Name:   </w:t>
+      </w:r>
+      <w:r>
+        <w:rPr>
+          <w:rFonts w:ascii="Times New Roman" w:hAnsi="Times New Roman" w:cs="Times New Roman"/>
+          <w:sz w:val="48"/>
+          <w:szCs w:val="48"/>
+        </w:rPr>
+        <w:t>Niyaz Ahmed Shayan</w:t>
+      </w:r>
+    </w:p>
+    <w:p>
+      <w:pPr>
+        <w:rPr>
+          <w:rFonts w:ascii="Times New Roman" w:hAnsi="Times New Roman" w:cs="Times New Roman"/>
+          <w:sz w:val="48"/>
+          <w:szCs w:val="48"/>
+        </w:rPr>
+      </w:pPr>
+      <w:proofErr w:type="gramStart"/>
+      <w:r>
+        <w:rPr>
+          <w:rFonts w:ascii="Times New Roman" w:hAnsi="Times New Roman" w:cs="Times New Roman"/>
+          <w:b/>
+          <w:bCs/>
+          <w:sz w:val="48"/>
+          <w:szCs w:val="48"/>
+        </w:rPr>
+        <w:t>ID :</w:t>
+      </w:r>
+      <w:proofErr w:type="gramEnd"/>
+      <w:r>
+        <w:rPr>
+          <w:rFonts w:ascii="Times New Roman" w:hAnsi="Times New Roman" w:cs="Times New Roman"/>
+          <w:sz w:val="48"/>
+          <w:szCs w:val="48"/>
+        </w:rPr>
+        <w:t xml:space="preserve"> a1930549</w:t>
+      </w:r>
+    </w:p>
+    <w:p>
+      <w:pPr>
+        <w:rPr>
+          <w:rFonts w:ascii="Times New Roman" w:hAnsi="Times New Roman" w:cs="Times New Roman"/>
+          <w:sz w:val="48"/>
+          <w:szCs w:val="48"/>
+        </w:rPr>
+      </w:pPr>
+      <w:r>
+        <w:rPr>
+          <w:rFonts w:ascii="Times New Roman" w:hAnsi="Times New Roman" w:cs="Times New Roman"/>
+          <w:b/>
+          <w:bCs/>
+          <w:sz w:val="48"/>
+          <w:szCs w:val="48"/>
+        </w:rPr>
+        <w:t>Submission Date:</w:t>
+      </w:r>
+      <w:r>
+        <w:rPr>
+          <w:rFonts w:ascii="Times New Roman" w:hAnsi="Times New Roman" w:cs="Times New Roman"/>
+          <w:sz w:val="48"/>
+          <w:szCs w:val="48"/>
+        </w:rPr>
+        <w:t xml:space="preserve"> </w:t>
+      </w:r>
+      <w:r>
+        <w:rPr>
+          <w:rFonts w:ascii="Times New Roman" w:hAnsi="Times New Roman" w:cs="Times New Roman"/>
+          <w:sz w:val="48"/>
+          <w:szCs w:val="48"/>
+        </w:rPr>
+        <w:t>02 April</w:t>
+      </w:r>
+      <w:r>
+        <w:rPr>
+          <w:rFonts w:ascii="Times New Roman" w:hAnsi="Times New Roman" w:cs="Times New Roman"/>
+          <w:sz w:val="48"/>
+          <w:szCs w:val="48"/>
+        </w:rPr>
+        <w:t xml:space="preserve"> 2026</w:t>
+      </w:r>
+    </w:p>
+    <w:p>
+      <w:pPr>
+        <w:rPr>
+          <w:rFonts w:ascii="Times New Roman" w:hAnsi="Times New Roman" w:cs="Times New Roman"/>
+          <w:sz w:val="48"/>
+          <w:szCs w:val="48"/>
+        </w:rPr>
+      </w:pPr>
+      <w:r>
+        <w:rPr>
+          <w:rFonts w:ascii="Times New Roman" w:hAnsi="Times New Roman" w:cs="Times New Roman"/>
+          <w:b/>
+          <w:bCs/>
+          <w:sz w:val="48"/>
+          <w:szCs w:val="48"/>
+        </w:rPr>
+        <w:t>Subject</w:t>
+      </w:r>
+      <w:r>
+        <w:rPr>
+          <w:rFonts w:ascii="Times New Roman" w:hAnsi="Times New Roman" w:cs="Times New Roman"/>
+          <w:sz w:val="48"/>
+          <w:szCs w:val="48"/>
+        </w:rPr>
+        <w:t xml:space="preserve">: </w:t>
+      </w:r>
+      <w:r>
+        <w:rPr>
+          <w:rFonts w:ascii="Times New Roman" w:hAnsi="Times New Roman" w:cs="Times New Roman"/>
+          <w:sz w:val="48"/>
+          <w:szCs w:val="48"/>
+        </w:rPr>
+        <w:t xml:space="preserve">Computer Vision and Multimodal Machine Learning </w:t>
+      </w:r>
+    </w:p>
+    <w:p>
+      <w:pPr>
+        <w:rPr>
+          <w:rFonts w:ascii="Times New Roman" w:hAnsi="Times New Roman" w:cs="Times New Roman"/>
+          <w:sz w:val="48"/>
+          <w:szCs w:val="48"/>
+        </w:rPr>
+      </w:pPr>
+      <w:r>
+        <w:rPr>
+          <w:rFonts w:ascii="Times New Roman" w:hAnsi="Times New Roman" w:cs="Times New Roman"/>
+          <w:b/>
+          <w:bCs/>
+          <w:sz w:val="48"/>
+          <w:szCs w:val="48"/>
+        </w:rPr>
+        <w:t>Topic:</w:t>
+      </w:r>
+      <w:r>
+        <w:rPr>
+          <w:rFonts w:ascii="Times New Roman" w:hAnsi="Times New Roman" w:cs="Times New Roman"/>
+          <w:sz w:val="48"/>
+          <w:szCs w:val="48"/>
+        </w:rPr>
+        <w:t xml:space="preserve"> </w:t>
+      </w:r>
+      <w:r>
+        <w:rPr>
+          <w:rFonts w:ascii="Times New Roman" w:hAnsi="Times New Roman" w:cs="Times New Roman"/>
+          <w:sz w:val="48"/>
+          <w:szCs w:val="48"/>
+        </w:rPr>
+        <w:t xml:space="preserve">Image Restoration and Object Detection </w:t>
+      </w:r>
+    </w:p>
     <w:p/>
     <w:p/>
     <w:p>
@@ -336,7 +603,13 @@
         <w:rPr>
           <w:rFonts w:ascii="Times New Roman" w:hAnsi="Times New Roman" w:cs="Times New Roman"/>
         </w:rPr>
-        <w:t>The Weiner</w:t>
+        <w:t xml:space="preserve">The </w:t>
+      </w:r>
+      <w:r>
+        <w:rPr>
+          <w:rFonts w:ascii="Times New Roman" w:hAnsi="Times New Roman" w:cs="Times New Roman"/>
+        </w:rPr>
+        <w:t>Wiener</w:t>
       </w:r>
       <w:r>
         <w:rPr>
@@ -708,208 +981,6 @@
                 <pic:pic xmlns:pic="http://schemas.openxmlformats.org/drawingml/2006/picture">
                   <pic:nvPicPr>
                     <pic:cNvPr id="1119598521" name="Picture 1119598521"/>
-                    <pic:cNvPicPr/>
-                  </pic:nvPicPr>
-                  <pic:blipFill>
-                    <a:blip r:embed="rId6">
-                      <a:extLst>
-                        <a:ext uri="{28A0092B-C50C-407E-A947-70E740481C1C}">
-                          <a14:useLocalDpi xmlns:a14="http://schemas.microsoft.com/office/drawing/2010/main" val="0"/>
-                        </a:ext>
-                      </a:extLst>
-                    </a:blip>
-                    <a:stretch>
-                      <a:fillRect/>
-                    </a:stretch>
-                  </pic:blipFill>
-                  <pic:spPr>
-                    <a:xfrm>
-                      <a:off x="0" y="0"/>
-                      <a:ext cx="5943600" cy="1887855"/>
-                    </a:xfrm>
-                    <a:prstGeom prst="rect">
-                      <a:avLst/>
-                    </a:prstGeom>
-                  </pic:spPr>
-                </pic:pic>
-              </a:graphicData>
-            </a:graphic>
-          </wp:inline>
-        </w:drawing>
-      </w:r>
-    </w:p>
-    <w:p>
-      <w:pPr>
-        <w:pStyle w:val="ListParagraph"/>
-        <w:tabs>
-          <w:tab w:val="left" w:pos="630"/>
-        </w:tabs>
-        <w:ind w:left="180"/>
-        <w:jc w:val="both"/>
-        <w:rPr>
-          <w:rFonts w:ascii="Times New Roman" w:hAnsi="Times New Roman" w:cs="Times New Roman"/>
-        </w:rPr>
-      </w:pPr>
-    </w:p>
-    <w:p>
-      <w:pPr>
-        <w:pStyle w:val="ListParagraph"/>
-        <w:tabs>
-          <w:tab w:val="left" w:pos="630"/>
-        </w:tabs>
-        <w:ind w:left="180"/>
-        <w:jc w:val="both"/>
-        <w:rPr>
-          <w:rFonts w:ascii="Times New Roman" w:hAnsi="Times New Roman" w:cs="Times New Roman"/>
-        </w:rPr>
-      </w:pPr>
-    </w:p>
-    <w:p>
-      <w:pPr>
-        <w:pStyle w:val="ListParagraph"/>
-        <w:tabs>
-          <w:tab w:val="left" w:pos="630"/>
-        </w:tabs>
-        <w:ind w:left="180"/>
-        <w:jc w:val="both"/>
-        <w:rPr>
-          <w:rFonts w:ascii="Times New Roman" w:hAnsi="Times New Roman" w:cs="Times New Roman"/>
-        </w:rPr>
-      </w:pPr>
-      <w:r>
-        <w:rPr>
-          <w:rFonts w:ascii="Times New Roman" w:hAnsi="Times New Roman" w:cs="Times New Roman"/>
-        </w:rPr>
-        <w:t xml:space="preserve">For processing the </w:t>
-      </w:r>
-      <w:r>
-        <w:rPr>
-          <w:rFonts w:ascii="Times New Roman" w:hAnsi="Times New Roman" w:cs="Times New Roman"/>
-        </w:rPr>
-        <w:t>images</w:t>
-      </w:r>
-      <w:r>
-        <w:rPr>
-          <w:rFonts w:ascii="Times New Roman" w:hAnsi="Times New Roman" w:cs="Times New Roman"/>
-        </w:rPr>
-        <w:t xml:space="preserve"> were converted into </w:t>
-      </w:r>
-      <w:r>
-        <w:rPr>
-          <w:rFonts w:ascii="Times New Roman" w:hAnsi="Times New Roman" w:cs="Times New Roman"/>
-        </w:rPr>
-        <w:t>grayscales</w:t>
-      </w:r>
-      <w:r>
-        <w:rPr>
-          <w:rFonts w:ascii="Times New Roman" w:hAnsi="Times New Roman" w:cs="Times New Roman"/>
-        </w:rPr>
-        <w:t xml:space="preserve"> to simplify computation and focus on structural information. Grayscale images reduce computational complexity while preserving important edge and texture details required for </w:t>
-      </w:r>
-      <w:r>
-        <w:rPr>
-          <w:rFonts w:ascii="Times New Roman" w:hAnsi="Times New Roman" w:cs="Times New Roman"/>
-        </w:rPr>
-        <w:t>deblurring.</w:t>
-      </w:r>
-    </w:p>
-    <w:p>
-      <w:pPr>
-        <w:pStyle w:val="ListParagraph"/>
-        <w:tabs>
-          <w:tab w:val="left" w:pos="630"/>
-        </w:tabs>
-        <w:ind w:left="180"/>
-        <w:jc w:val="both"/>
-        <w:rPr>
-          <w:rFonts w:ascii="Times New Roman" w:hAnsi="Times New Roman" w:cs="Times New Roman"/>
-        </w:rPr>
-      </w:pPr>
-    </w:p>
-    <w:p>
-      <w:pPr>
-        <w:pStyle w:val="ListParagraph"/>
-        <w:tabs>
-          <w:tab w:val="left" w:pos="630"/>
-        </w:tabs>
-        <w:ind w:left="180"/>
-        <w:jc w:val="both"/>
-        <w:rPr>
-          <w:rFonts w:ascii="Times New Roman" w:hAnsi="Times New Roman" w:cs="Times New Roman"/>
-        </w:rPr>
-      </w:pPr>
-      <w:r>
-        <w:rPr>
-          <w:rFonts w:ascii="Times New Roman" w:hAnsi="Times New Roman" w:cs="Times New Roman"/>
-          <w:b/>
-          <w:bCs/>
-        </w:rPr>
-        <w:t xml:space="preserve">Figure </w:t>
-      </w:r>
-      <w:r>
-        <w:rPr>
-          <w:rFonts w:ascii="Times New Roman" w:hAnsi="Times New Roman" w:cs="Times New Roman"/>
-          <w:b/>
-          <w:bCs/>
-        </w:rPr>
-        <w:t>2</w:t>
-      </w:r>
-      <w:r>
-        <w:rPr>
-          <w:rFonts w:ascii="Times New Roman" w:hAnsi="Times New Roman" w:cs="Times New Roman"/>
-        </w:rPr>
-        <w:t>:</w:t>
-      </w:r>
-      <w:r>
-        <w:rPr>
-          <w:rFonts w:ascii="Times New Roman" w:hAnsi="Times New Roman" w:cs="Times New Roman"/>
-        </w:rPr>
-        <w:t xml:space="preserve"> Grayscale conversion of blurred and sharp images used for deblurring.</w:t>
-      </w:r>
-    </w:p>
-    <w:p>
-      <w:pPr>
-        <w:pStyle w:val="ListParagraph"/>
-        <w:tabs>
-          <w:tab w:val="left" w:pos="630"/>
-        </w:tabs>
-        <w:ind w:left="180"/>
-        <w:jc w:val="both"/>
-        <w:rPr>
-          <w:rFonts w:ascii="Times New Roman" w:hAnsi="Times New Roman" w:cs="Times New Roman"/>
-        </w:rPr>
-      </w:pPr>
-    </w:p>
-    <w:p>
-      <w:pPr>
-        <w:pStyle w:val="ListParagraph"/>
-        <w:tabs>
-          <w:tab w:val="left" w:pos="630"/>
-        </w:tabs>
-        <w:ind w:left="180"/>
-        <w:jc w:val="both"/>
-        <w:rPr>
-          <w:rFonts w:ascii="Times New Roman" w:hAnsi="Times New Roman" w:cs="Times New Roman"/>
-        </w:rPr>
-      </w:pPr>
-      <w:r>
-        <w:rPr>
-          <w:rFonts w:ascii="Times New Roman" w:hAnsi="Times New Roman" w:cs="Times New Roman"/>
-          <w:noProof/>
-        </w:rPr>
-        <w:drawing>
-          <wp:inline distT="0" distB="0" distL="0" distR="0" wp14:anchorId="0F16B3C3" wp14:editId="10AB292A">
-            <wp:extent cx="5943600" cy="1887855"/>
-            <wp:effectExtent l="0" t="0" r="0" b="0"/>
-            <wp:docPr id="783798373" name="Picture 2"/>
-            <wp:cNvGraphicFramePr>
-              <a:graphicFrameLocks xmlns:a="http://schemas.openxmlformats.org/drawingml/2006/main" noChangeAspect="1"/>
-            </wp:cNvGraphicFramePr>
-            <a:graphic xmlns:a="http://schemas.openxmlformats.org/drawingml/2006/main">
-              <a:graphicData uri="http://schemas.openxmlformats.org/drawingml/2006/picture">
-                <pic:pic xmlns:pic="http://schemas.openxmlformats.org/drawingml/2006/picture">
-                  <pic:nvPicPr>
-                    <pic:cNvPr id="783798373" name="Picture 783798373"/>
                     <pic:cNvPicPr/>
                   </pic:nvPicPr>
                   <pic:blipFill>
@@ -942,6 +1013,208 @@
     </w:p>
     <w:p>
       <w:pPr>
+        <w:pStyle w:val="ListParagraph"/>
+        <w:tabs>
+          <w:tab w:val="left" w:pos="630"/>
+        </w:tabs>
+        <w:ind w:left="180"/>
+        <w:jc w:val="both"/>
+        <w:rPr>
+          <w:rFonts w:ascii="Times New Roman" w:hAnsi="Times New Roman" w:cs="Times New Roman"/>
+        </w:rPr>
+      </w:pPr>
+    </w:p>
+    <w:p>
+      <w:pPr>
+        <w:pStyle w:val="ListParagraph"/>
+        <w:tabs>
+          <w:tab w:val="left" w:pos="630"/>
+        </w:tabs>
+        <w:ind w:left="180"/>
+        <w:jc w:val="both"/>
+        <w:rPr>
+          <w:rFonts w:ascii="Times New Roman" w:hAnsi="Times New Roman" w:cs="Times New Roman"/>
+        </w:rPr>
+      </w:pPr>
+    </w:p>
+    <w:p>
+      <w:pPr>
+        <w:pStyle w:val="ListParagraph"/>
+        <w:tabs>
+          <w:tab w:val="left" w:pos="630"/>
+        </w:tabs>
+        <w:ind w:left="180"/>
+        <w:jc w:val="both"/>
+        <w:rPr>
+          <w:rFonts w:ascii="Times New Roman" w:hAnsi="Times New Roman" w:cs="Times New Roman"/>
+        </w:rPr>
+      </w:pPr>
+      <w:r>
+        <w:rPr>
+          <w:rFonts w:ascii="Times New Roman" w:hAnsi="Times New Roman" w:cs="Times New Roman"/>
+        </w:rPr>
+        <w:t xml:space="preserve">For processing the </w:t>
+      </w:r>
+      <w:r>
+        <w:rPr>
+          <w:rFonts w:ascii="Times New Roman" w:hAnsi="Times New Roman" w:cs="Times New Roman"/>
+        </w:rPr>
+        <w:t>images</w:t>
+      </w:r>
+      <w:r>
+        <w:rPr>
+          <w:rFonts w:ascii="Times New Roman" w:hAnsi="Times New Roman" w:cs="Times New Roman"/>
+        </w:rPr>
+        <w:t xml:space="preserve"> were converted into </w:t>
+      </w:r>
+      <w:r>
+        <w:rPr>
+          <w:rFonts w:ascii="Times New Roman" w:hAnsi="Times New Roman" w:cs="Times New Roman"/>
+        </w:rPr>
+        <w:t>grayscales</w:t>
+      </w:r>
+      <w:r>
+        <w:rPr>
+          <w:rFonts w:ascii="Times New Roman" w:hAnsi="Times New Roman" w:cs="Times New Roman"/>
+        </w:rPr>
+        <w:t xml:space="preserve"> to simplify computation and focus on structural information. Grayscale images reduce computational complexity while preserving important edge and texture details required for </w:t>
+      </w:r>
+      <w:r>
+        <w:rPr>
+          <w:rFonts w:ascii="Times New Roman" w:hAnsi="Times New Roman" w:cs="Times New Roman"/>
+        </w:rPr>
+        <w:t>deblurring.</w:t>
+      </w:r>
+    </w:p>
+    <w:p>
+      <w:pPr>
+        <w:pStyle w:val="ListParagraph"/>
+        <w:tabs>
+          <w:tab w:val="left" w:pos="630"/>
+        </w:tabs>
+        <w:ind w:left="180"/>
+        <w:jc w:val="both"/>
+        <w:rPr>
+          <w:rFonts w:ascii="Times New Roman" w:hAnsi="Times New Roman" w:cs="Times New Roman"/>
+        </w:rPr>
+      </w:pPr>
+    </w:p>
+    <w:p>
+      <w:pPr>
+        <w:pStyle w:val="ListParagraph"/>
+        <w:tabs>
+          <w:tab w:val="left" w:pos="630"/>
+        </w:tabs>
+        <w:ind w:left="180"/>
+        <w:jc w:val="both"/>
+        <w:rPr>
+          <w:rFonts w:ascii="Times New Roman" w:hAnsi="Times New Roman" w:cs="Times New Roman"/>
+        </w:rPr>
+      </w:pPr>
+      <w:r>
+        <w:rPr>
+          <w:rFonts w:ascii="Times New Roman" w:hAnsi="Times New Roman" w:cs="Times New Roman"/>
+          <w:b/>
+          <w:bCs/>
+        </w:rPr>
+        <w:t xml:space="preserve">Figure </w:t>
+      </w:r>
+      <w:r>
+        <w:rPr>
+          <w:rFonts w:ascii="Times New Roman" w:hAnsi="Times New Roman" w:cs="Times New Roman"/>
+          <w:b/>
+          <w:bCs/>
+        </w:rPr>
+        <w:t>2</w:t>
+      </w:r>
+      <w:r>
+        <w:rPr>
+          <w:rFonts w:ascii="Times New Roman" w:hAnsi="Times New Roman" w:cs="Times New Roman"/>
+        </w:rPr>
+        <w:t>:</w:t>
+      </w:r>
+      <w:r>
+        <w:rPr>
+          <w:rFonts w:ascii="Times New Roman" w:hAnsi="Times New Roman" w:cs="Times New Roman"/>
+        </w:rPr>
+        <w:t xml:space="preserve"> Grayscale conversion of blurred and sharp images used for deblurring.</w:t>
+      </w:r>
+    </w:p>
+    <w:p>
+      <w:pPr>
+        <w:pStyle w:val="ListParagraph"/>
+        <w:tabs>
+          <w:tab w:val="left" w:pos="630"/>
+        </w:tabs>
+        <w:ind w:left="180"/>
+        <w:jc w:val="both"/>
+        <w:rPr>
+          <w:rFonts w:ascii="Times New Roman" w:hAnsi="Times New Roman" w:cs="Times New Roman"/>
+        </w:rPr>
+      </w:pPr>
+    </w:p>
+    <w:p>
+      <w:pPr>
+        <w:pStyle w:val="ListParagraph"/>
+        <w:tabs>
+          <w:tab w:val="left" w:pos="630"/>
+        </w:tabs>
+        <w:ind w:left="180"/>
+        <w:jc w:val="both"/>
+        <w:rPr>
+          <w:rFonts w:ascii="Times New Roman" w:hAnsi="Times New Roman" w:cs="Times New Roman"/>
+        </w:rPr>
+      </w:pPr>
+      <w:r>
+        <w:rPr>
+          <w:rFonts w:ascii="Times New Roman" w:hAnsi="Times New Roman" w:cs="Times New Roman"/>
+          <w:noProof/>
+        </w:rPr>
+        <w:drawing>
+          <wp:inline distT="0" distB="0" distL="0" distR="0" wp14:anchorId="0F16B3C3" wp14:editId="10AB292A">
+            <wp:extent cx="5943600" cy="1887855"/>
+            <wp:effectExtent l="0" t="0" r="0" b="0"/>
+            <wp:docPr id="783798373" name="Picture 2"/>
+            <wp:cNvGraphicFramePr>
+              <a:graphicFrameLocks xmlns:a="http://schemas.openxmlformats.org/drawingml/2006/main" noChangeAspect="1"/>
+            </wp:cNvGraphicFramePr>
+            <a:graphic xmlns:a="http://schemas.openxmlformats.org/drawingml/2006/main">
+              <a:graphicData uri="http://schemas.openxmlformats.org/drawingml/2006/picture">
+                <pic:pic xmlns:pic="http://schemas.openxmlformats.org/drawingml/2006/picture">
+                  <pic:nvPicPr>
+                    <pic:cNvPr id="783798373" name="Picture 783798373"/>
+                    <pic:cNvPicPr/>
+                  </pic:nvPicPr>
+                  <pic:blipFill>
+                    <a:blip r:embed="rId8">
+                      <a:extLst>
+                        <a:ext uri="{28A0092B-C50C-407E-A947-70E740481C1C}">
+                          <a14:useLocalDpi xmlns:a14="http://schemas.microsoft.com/office/drawing/2010/main" val="0"/>
+                        </a:ext>
+                      </a:extLst>
+                    </a:blip>
+                    <a:stretch>
+                      <a:fillRect/>
+                    </a:stretch>
+                  </pic:blipFill>
+                  <pic:spPr>
+                    <a:xfrm>
+                      <a:off x="0" y="0"/>
+                      <a:ext cx="5943600" cy="1887855"/>
+                    </a:xfrm>
+                    <a:prstGeom prst="rect">
+                      <a:avLst/>
+                    </a:prstGeom>
+                  </pic:spPr>
+                </pic:pic>
+              </a:graphicData>
+            </a:graphic>
+          </wp:inline>
+        </w:drawing>
+      </w:r>
+    </w:p>
+    <w:p>
+      <w:pPr>
         <w:ind w:left="360"/>
         <w:jc w:val="both"/>
         <w:rPr>
@@ -966,6 +1239,99 @@
         </w:rPr>
         <w:t>This dataset was organized for experimentation where blurred images were used as inputs and sharp images served as ground truth for evaluation. This setup ensures a fair comparison of restoration performance</w:t>
       </w:r>
+    </w:p>
+    <w:p>
+      <w:pPr>
+        <w:pStyle w:val="ListParagraph"/>
+        <w:ind w:left="0"/>
+        <w:jc w:val="both"/>
+        <w:rPr>
+          <w:rFonts w:ascii="Times New Roman" w:hAnsi="Times New Roman" w:cs="Times New Roman"/>
+          <w:b/>
+          <w:bCs/>
+        </w:rPr>
+      </w:pPr>
+      <w:r>
+        <w:rPr>
+          <w:rFonts w:ascii="Times New Roman" w:hAnsi="Times New Roman" w:cs="Times New Roman"/>
+          <w:b/>
+          <w:bCs/>
+        </w:rPr>
+        <w:lastRenderedPageBreak/>
+        <w:t>3.1 Dataset Annotation and Preparation</w:t>
+      </w:r>
+    </w:p>
+    <w:p>
+      <w:pPr>
+        <w:pStyle w:val="ListParagraph"/>
+        <w:ind w:left="0"/>
+        <w:jc w:val="both"/>
+        <w:rPr>
+          <w:rFonts w:ascii="Times New Roman" w:hAnsi="Times New Roman" w:cs="Times New Roman"/>
+        </w:rPr>
+      </w:pPr>
+      <w:r>
+        <w:rPr>
+          <w:rFonts w:ascii="Times New Roman" w:hAnsi="Times New Roman" w:cs="Times New Roman"/>
+        </w:rPr>
+        <w:t>To prepare the dataset for objects detection training</w:t>
+      </w:r>
+      <w:r>
+        <w:rPr>
+          <w:rFonts w:ascii="Times New Roman" w:hAnsi="Times New Roman" w:cs="Times New Roman"/>
+        </w:rPr>
+        <w:t xml:space="preserve">, pseudo-labels were generated using a pre-trained YOLOv8 model. The model was applied to deblurred images to automatically detect objects and generate bounding box annotations in YOLO </w:t>
+      </w:r>
+      <w:proofErr w:type="gramStart"/>
+      <w:r>
+        <w:rPr>
+          <w:rFonts w:ascii="Times New Roman" w:hAnsi="Times New Roman" w:cs="Times New Roman"/>
+        </w:rPr>
+        <w:t>format .</w:t>
+      </w:r>
+      <w:proofErr w:type="gramEnd"/>
+      <w:r>
+        <w:rPr>
+          <w:rFonts w:ascii="Times New Roman" w:hAnsi="Times New Roman" w:cs="Times New Roman"/>
+        </w:rPr>
+        <w:t xml:space="preserve"> The dataset was then split into </w:t>
+      </w:r>
+      <w:proofErr w:type="gramStart"/>
+      <w:r>
+        <w:rPr>
+          <w:rFonts w:ascii="Times New Roman" w:hAnsi="Times New Roman" w:cs="Times New Roman"/>
+        </w:rPr>
+        <w:t xml:space="preserve">training </w:t>
+      </w:r>
+      <w:r>
+        <w:rPr>
+          <w:rFonts w:ascii="Times New Roman" w:hAnsi="Times New Roman" w:cs="Times New Roman"/>
+        </w:rPr>
+        <w:t xml:space="preserve"> and</w:t>
+      </w:r>
+      <w:proofErr w:type="gramEnd"/>
+      <w:r>
+        <w:rPr>
+          <w:rFonts w:ascii="Times New Roman" w:hAnsi="Times New Roman" w:cs="Times New Roman"/>
+        </w:rPr>
+        <w:t xml:space="preserve"> validation sets using an 80-20 ratio. Ransom shuffling was applied to ensure a balanced distribution</w:t>
+      </w:r>
+      <w:r>
+        <w:rPr>
+          <w:rFonts w:ascii="Times New Roman" w:hAnsi="Times New Roman" w:cs="Times New Roman"/>
+        </w:rPr>
+        <w:t xml:space="preserve"> of images across both sets. This split allows proper evaluation of the model during training </w:t>
+      </w:r>
+    </w:p>
+    <w:p>
+      <w:pPr>
+        <w:pStyle w:val="ListParagraph"/>
+        <w:ind w:left="0"/>
+        <w:jc w:val="both"/>
+        <w:rPr>
+          <w:rFonts w:ascii="Times New Roman" w:hAnsi="Times New Roman" w:cs="Times New Roman"/>
+        </w:rPr>
+      </w:pPr>
     </w:p>
     <w:p>
       <w:pPr>
@@ -993,7 +1359,6 @@
           <w:szCs w:val="28"/>
           <w:u w:val="single"/>
         </w:rPr>
-        <w:lastRenderedPageBreak/>
         <w:t>Experiments</w:t>
       </w:r>
     </w:p>
@@ -1008,7 +1373,19 @@
         <w:rPr>
           <w:rFonts w:ascii="Times New Roman" w:hAnsi="Times New Roman" w:cs="Times New Roman"/>
         </w:rPr>
-        <w:t xml:space="preserve">The Weiner filter was applied to restore motion blurred images. The results were evaluated using both </w:t>
+        <w:t xml:space="preserve">The </w:t>
+      </w:r>
+      <w:r>
+        <w:rPr>
+          <w:rFonts w:ascii="Times New Roman" w:hAnsi="Times New Roman" w:cs="Times New Roman"/>
+        </w:rPr>
+        <w:t>Wiener</w:t>
+      </w:r>
+      <w:r>
+        <w:rPr>
+          <w:rFonts w:ascii="Times New Roman" w:hAnsi="Times New Roman" w:cs="Times New Roman"/>
+        </w:rPr>
+        <w:t xml:space="preserve"> filter was applied to restore motion blurred images. The results were evaluated using both </w:t>
       </w:r>
       <w:r>
         <w:rPr>
@@ -1040,7 +1417,19 @@
         <w:rPr>
           <w:rFonts w:ascii="Times New Roman" w:hAnsi="Times New Roman" w:cs="Times New Roman"/>
         </w:rPr>
-        <w:t xml:space="preserve"> were performed between blurred images, restored images and ground truth sharp images to access the improvement in image quality. The Weiner filter was applied in the frequency domain using a motion blur kernel. The restored image was obtained after inverse Fourier transformation and normalization </w:t>
+        <w:t xml:space="preserve"> were performed between blurred images, restored images and ground truth sharp images to access the improvement in image quality. The </w:t>
+      </w:r>
+      <w:r>
+        <w:rPr>
+          <w:rFonts w:ascii="Times New Roman" w:hAnsi="Times New Roman" w:cs="Times New Roman"/>
+        </w:rPr>
+        <w:t>Wiener</w:t>
+      </w:r>
+      <w:r>
+        <w:rPr>
+          <w:rFonts w:ascii="Times New Roman" w:hAnsi="Times New Roman" w:cs="Times New Roman"/>
+        </w:rPr>
+        <w:t xml:space="preserve"> filter was applied in the frequency domain using a motion blur kernel. The restored image was obtained after inverse Fourier transformation and normalization </w:t>
       </w:r>
     </w:p>
     <w:p>
@@ -1071,7 +1460,7 @@
                     <pic:cNvPicPr/>
                   </pic:nvPicPr>
                   <pic:blipFill>
-                    <a:blip r:embed="rId8">
+                    <a:blip r:embed="rId9">
                       <a:extLst>
                         <a:ext uri="{28A0092B-C50C-407E-A947-70E740481C1C}">
                           <a14:useLocalDpi xmlns:a14="http://schemas.microsoft.com/office/drawing/2010/main" val="0"/>
@@ -1124,14 +1513,32 @@
         <w:rPr>
           <w:rFonts w:ascii="Times New Roman" w:hAnsi="Times New Roman" w:cs="Times New Roman"/>
         </w:rPr>
-        <w:t>Weiner  restored</w:t>
+        <w:t>Wiener</w:t>
+      </w:r>
+      <w:r>
+        <w:rPr>
+          <w:rFonts w:ascii="Times New Roman" w:hAnsi="Times New Roman" w:cs="Times New Roman"/>
+        </w:rPr>
+        <w:t xml:space="preserve">  restored</w:t>
       </w:r>
       <w:proofErr w:type="gramEnd"/>
       <w:r>
         <w:rPr>
           <w:rFonts w:ascii="Times New Roman" w:hAnsi="Times New Roman" w:cs="Times New Roman"/>
         </w:rPr>
-        <w:t xml:space="preserve"> image and ground-truth image. The Weiner filter reduces motion blur and improves overall image clarity although some smoothing of fine details is observed. </w:t>
+        <w:t xml:space="preserve"> image and ground-truth image. The </w:t>
+      </w:r>
+      <w:r>
+        <w:rPr>
+          <w:rFonts w:ascii="Times New Roman" w:hAnsi="Times New Roman" w:cs="Times New Roman"/>
+        </w:rPr>
+        <w:t>Wiener</w:t>
+      </w:r>
+      <w:r>
+        <w:rPr>
+          <w:rFonts w:ascii="Times New Roman" w:hAnsi="Times New Roman" w:cs="Times New Roman"/>
+        </w:rPr>
+        <w:t xml:space="preserve"> filter reduces motion blur and improves overall image clarity although some smoothing of fine details is observed. </w:t>
       </w:r>
     </w:p>
     <w:p>
@@ -1163,24 +1570,68 @@
         <w:rPr>
           <w:rFonts w:ascii="Times New Roman" w:hAnsi="Times New Roman" w:cs="Times New Roman"/>
         </w:rPr>
-        <w:t>by comparing the restored image with the ground truth sharp image. The PSNR value obtained was approximately 9.5 db. This relatively low value indicates that although the restored image shows visible improvement compared to the blurred image it still differs significantly from the original sharp image in terms of pixel level accuracy.</w:t>
+        <w:t>by comparing the restored image with the ground truth sharp image. The PSNR value obtained was approximately 9.5 d</w:t>
+      </w:r>
+      <w:r>
+        <w:rPr>
+          <w:rFonts w:ascii="Times New Roman" w:hAnsi="Times New Roman" w:cs="Times New Roman"/>
+        </w:rPr>
+        <w:t>b.</w:t>
+      </w:r>
+      <w:r>
+        <w:rPr>
+          <w:rFonts w:ascii="Times New Roman" w:hAnsi="Times New Roman" w:cs="Times New Roman"/>
+        </w:rPr>
+        <w:t xml:space="preserve"> This relatively low value indicates that although the restored image shows visible improvement compared to the blurred image it still differs significantly from the original sharp image in terms of pixel level </w:t>
+      </w:r>
+      <w:r>
+        <w:rPr>
+          <w:rFonts w:ascii="Times New Roman" w:hAnsi="Times New Roman" w:cs="Times New Roman"/>
+        </w:rPr>
+        <w:t xml:space="preserve">accuracy. In contrast the SSIM value was approximately </w:t>
+      </w:r>
+      <w:proofErr w:type="gramStart"/>
+      <w:r>
+        <w:rPr>
+          <w:rFonts w:ascii="Times New Roman" w:hAnsi="Times New Roman" w:cs="Times New Roman"/>
+        </w:rPr>
+        <w:t>0.9846 ,</w:t>
+      </w:r>
+      <w:proofErr w:type="gramEnd"/>
+      <w:r>
+        <w:rPr>
+          <w:rFonts w:ascii="Times New Roman" w:hAnsi="Times New Roman" w:cs="Times New Roman"/>
+        </w:rPr>
+        <w:t xml:space="preserve"> </w:t>
+      </w:r>
+      <w:r>
+        <w:rPr>
+          <w:rFonts w:ascii="Times New Roman" w:hAnsi="Times New Roman" w:cs="Times New Roman"/>
+        </w:rPr>
+        <w:t>which indicates</w:t>
+      </w:r>
+      <w:r>
+        <w:rPr>
+          <w:rFonts w:ascii="Times New Roman" w:hAnsi="Times New Roman" w:cs="Times New Roman"/>
+        </w:rPr>
+        <w:t xml:space="preserve"> a high level of structural similarity</w:t>
       </w:r>
     </w:p>
     <w:tbl>
       <w:tblPr>
         <w:tblStyle w:val="TableGrid"/>
         <w:tblW w:w="0" w:type="auto"/>
-        <w:tblInd w:w="-5" w:type="dxa"/>
         <w:tblLook w:val="04A0" w:firstRow="1" w:lastRow="0" w:firstColumn="1" w:lastColumn="0" w:noHBand="0" w:noVBand="1"/>
       </w:tblPr>
       <w:tblGrid>
-        <w:gridCol w:w="1530"/>
-        <w:gridCol w:w="2520"/>
+        <w:gridCol w:w="3116"/>
+        <w:gridCol w:w="3117"/>
+        <w:gridCol w:w="3117"/>
       </w:tblGrid>
       <w:tr>
         <w:tc>
           <w:tcPr>
-            <w:tcW w:w="1530" w:type="dxa"/>
+            <w:tcW w:w="3116" w:type="dxa"/>
           </w:tcPr>
           <w:p>
             <w:pPr>
@@ -1196,33 +1647,13 @@
                 <w:b/>
                 <w:bCs/>
               </w:rPr>
-              <w:t xml:space="preserve">Method </w:t>
+              <w:t>Method</w:t>
             </w:r>
           </w:p>
         </w:tc>
         <w:tc>
           <w:tcPr>
-            <w:tcW w:w="2520" w:type="dxa"/>
-          </w:tcPr>
-          <w:p>
-            <w:pPr>
-              <w:rPr>
-                <w:rFonts w:ascii="Times New Roman" w:hAnsi="Times New Roman" w:cs="Times New Roman"/>
-              </w:rPr>
-            </w:pPr>
-            <w:r>
-              <w:rPr>
-                <w:rFonts w:ascii="Times New Roman" w:hAnsi="Times New Roman" w:cs="Times New Roman"/>
-              </w:rPr>
-              <w:t>PSNR (db.)</w:t>
-            </w:r>
-          </w:p>
-        </w:tc>
-      </w:tr>
-      <w:tr>
-        <w:tc>
-          <w:tcPr>
-            <w:tcW w:w="1530" w:type="dxa"/>
+            <w:tcW w:w="3117" w:type="dxa"/>
           </w:tcPr>
           <w:p>
             <w:pPr>
@@ -1238,13 +1669,77 @@
                 <w:b/>
                 <w:bCs/>
               </w:rPr>
-              <w:t xml:space="preserve">Weiner </w:t>
+              <w:t>PSNR (</w:t>
+            </w:r>
+            <w:proofErr w:type="spellStart"/>
+            <w:r>
+              <w:rPr>
+                <w:rFonts w:ascii="Times New Roman" w:hAnsi="Times New Roman" w:cs="Times New Roman"/>
+                <w:b/>
+                <w:bCs/>
+              </w:rPr>
+              <w:t>db</w:t>
+            </w:r>
+            <w:proofErr w:type="spellEnd"/>
+            <w:r>
+              <w:rPr>
+                <w:rFonts w:ascii="Times New Roman" w:hAnsi="Times New Roman" w:cs="Times New Roman"/>
+                <w:b/>
+                <w:bCs/>
+              </w:rPr>
+              <w:t>)</w:t>
             </w:r>
           </w:p>
         </w:tc>
         <w:tc>
           <w:tcPr>
-            <w:tcW w:w="2520" w:type="dxa"/>
+            <w:tcW w:w="3117" w:type="dxa"/>
+          </w:tcPr>
+          <w:p>
+            <w:pPr>
+              <w:rPr>
+                <w:rFonts w:ascii="Times New Roman" w:hAnsi="Times New Roman" w:cs="Times New Roman"/>
+                <w:b/>
+                <w:bCs/>
+              </w:rPr>
+            </w:pPr>
+            <w:r>
+              <w:rPr>
+                <w:rFonts w:ascii="Times New Roman" w:hAnsi="Times New Roman" w:cs="Times New Roman"/>
+                <w:b/>
+                <w:bCs/>
+              </w:rPr>
+              <w:t>SSIM</w:t>
+            </w:r>
+          </w:p>
+        </w:tc>
+      </w:tr>
+      <w:tr>
+        <w:tc>
+          <w:tcPr>
+            <w:tcW w:w="3116" w:type="dxa"/>
+          </w:tcPr>
+          <w:p>
+            <w:pPr>
+              <w:rPr>
+                <w:rFonts w:ascii="Times New Roman" w:hAnsi="Times New Roman" w:cs="Times New Roman"/>
+                <w:b/>
+                <w:bCs/>
+              </w:rPr>
+            </w:pPr>
+            <w:r>
+              <w:rPr>
+                <w:rFonts w:ascii="Times New Roman" w:hAnsi="Times New Roman" w:cs="Times New Roman"/>
+                <w:b/>
+                <w:bCs/>
+              </w:rPr>
+              <w:t>Wiener</w:t>
+            </w:r>
+          </w:p>
+        </w:tc>
+        <w:tc>
+          <w:tcPr>
+            <w:tcW w:w="3117" w:type="dxa"/>
           </w:tcPr>
           <w:p>
             <w:pPr>
@@ -1256,7 +1751,31 @@
               <w:rPr>
                 <w:rFonts w:ascii="Times New Roman" w:hAnsi="Times New Roman" w:cs="Times New Roman"/>
               </w:rPr>
-              <w:t>9.50953612209963</w:t>
+              <w:t>9.51</w:t>
+            </w:r>
+          </w:p>
+        </w:tc>
+        <w:tc>
+          <w:tcPr>
+            <w:tcW w:w="3117" w:type="dxa"/>
+          </w:tcPr>
+          <w:p>
+            <w:pPr>
+              <w:rPr>
+                <w:rFonts w:ascii="Times New Roman" w:hAnsi="Times New Roman" w:cs="Times New Roman"/>
+              </w:rPr>
+            </w:pPr>
+            <w:r>
+              <w:rPr>
+                <w:rFonts w:ascii="Times New Roman" w:hAnsi="Times New Roman" w:cs="Times New Roman"/>
+              </w:rPr>
+              <w:t>0.98</w:t>
+            </w:r>
+            <w:r>
+              <w:rPr>
+                <w:rFonts w:ascii="Times New Roman" w:hAnsi="Times New Roman" w:cs="Times New Roman"/>
+              </w:rPr>
+              <w:t>46</w:t>
             </w:r>
           </w:p>
         </w:tc>
@@ -1280,7 +1799,19 @@
         <w:rPr>
           <w:rFonts w:ascii="Times New Roman" w:hAnsi="Times New Roman" w:cs="Times New Roman"/>
         </w:rPr>
-        <w:t xml:space="preserve">From visual inspection, the Weiner filter successfully reduces motion blur and improves the visibility of major structures in the image. Edges and object boundaries become clearer compared to the blurred input. </w:t>
+        <w:t xml:space="preserve">From visual inspection, the </w:t>
+      </w:r>
+      <w:r>
+        <w:rPr>
+          <w:rFonts w:ascii="Times New Roman" w:hAnsi="Times New Roman" w:cs="Times New Roman"/>
+        </w:rPr>
+        <w:t>Wiener</w:t>
+      </w:r>
+      <w:r>
+        <w:rPr>
+          <w:rFonts w:ascii="Times New Roman" w:hAnsi="Times New Roman" w:cs="Times New Roman"/>
+        </w:rPr>
+        <w:t xml:space="preserve"> filter successfully reduces motion blur and improves the visibility of major structures in the image. Edges and object boundaries become clearer compared to the blurred input. </w:t>
       </w:r>
       <w:r>
         <w:rPr>
@@ -1306,21 +1837,260 @@
         <w:rPr>
           <w:rFonts w:ascii="Times New Roman" w:hAnsi="Times New Roman" w:cs="Times New Roman"/>
         </w:rPr>
-        <w:t xml:space="preserve"> indicating loss of fine details. This is known limitation of Weiner filtering as the regularization </w:t>
+        <w:t xml:space="preserve"> indicating </w:t>
+      </w:r>
+      <w:r>
+        <w:rPr>
+          <w:rFonts w:ascii="Times New Roman" w:hAnsi="Times New Roman" w:cs="Times New Roman"/>
+        </w:rPr>
+        <w:lastRenderedPageBreak/>
+        <w:t xml:space="preserve">loss of fine details. This is known limitation of </w:t>
+      </w:r>
+      <w:r>
+        <w:rPr>
+          <w:rFonts w:ascii="Times New Roman" w:hAnsi="Times New Roman" w:cs="Times New Roman"/>
+        </w:rPr>
+        <w:t>Wiener</w:t>
+      </w:r>
+      <w:r>
+        <w:rPr>
+          <w:rFonts w:ascii="Times New Roman" w:hAnsi="Times New Roman" w:cs="Times New Roman"/>
+        </w:rPr>
+        <w:t xml:space="preserve"> filtering as the regularization parameter suppresses noise at the cost of high frequency details. The results demonstrate that while Wiener filtering improves perceptual quality it does not fully recover the original sharp image.</w:t>
+      </w:r>
+    </w:p>
+    <w:p>
+      <w:pPr>
+        <w:jc w:val="both"/>
+        <w:rPr>
+          <w:rFonts w:ascii="Times New Roman" w:hAnsi="Times New Roman" w:cs="Times New Roman"/>
+        </w:rPr>
+      </w:pPr>
+    </w:p>
+    <w:p>
+      <w:pPr>
+        <w:jc w:val="both"/>
+        <w:rPr>
+          <w:rFonts w:ascii="Times New Roman" w:hAnsi="Times New Roman" w:cs="Times New Roman"/>
+          <w:b/>
+          <w:bCs/>
+        </w:rPr>
+      </w:pPr>
+      <w:r>
+        <w:rPr>
+          <w:rFonts w:ascii="Times New Roman" w:hAnsi="Times New Roman" w:cs="Times New Roman"/>
+          <w:b/>
+          <w:bCs/>
+        </w:rPr>
+        <w:t xml:space="preserve">4.1 Object Detection Training </w:t>
+      </w:r>
+    </w:p>
+    <w:p>
+      <w:pPr>
+        <w:jc w:val="both"/>
+        <w:rPr>
+          <w:rFonts w:ascii="Times New Roman" w:hAnsi="Times New Roman" w:cs="Times New Roman"/>
+        </w:rPr>
+      </w:pPr>
+      <w:r>
+        <w:rPr>
+          <w:rFonts w:ascii="Times New Roman" w:hAnsi="Times New Roman" w:cs="Times New Roman"/>
+        </w:rPr>
+        <w:t xml:space="preserve">The YOLOv8 model was fine tuning using the </w:t>
       </w:r>
       <w:proofErr w:type="gramStart"/>
       <w:r>
         <w:rPr>
           <w:rFonts w:ascii="Times New Roman" w:hAnsi="Times New Roman" w:cs="Times New Roman"/>
         </w:rPr>
-        <w:t>parameter</w:t>
+        <w:t>generation  dataset</w:t>
       </w:r>
       <w:proofErr w:type="gramEnd"/>
       <w:r>
         <w:rPr>
           <w:rFonts w:ascii="Times New Roman" w:hAnsi="Times New Roman" w:cs="Times New Roman"/>
         </w:rPr>
-        <w:t xml:space="preserve"> suppresses noise at the cost of high frequency details. The results demonstrate that while Wiener filtering improves perceptual quality it does not fully recover the original sharp image.</w:t>
+        <w:t xml:space="preserve"> . Training was performed for 10 epochs </w:t>
+      </w:r>
+      <w:r>
+        <w:rPr>
+          <w:rFonts w:ascii="Times New Roman" w:hAnsi="Times New Roman" w:cs="Times New Roman"/>
+        </w:rPr>
+        <w:t xml:space="preserve"> with an image size of 640 and batch size of 16</w:t>
+      </w:r>
+      <w:r>
+        <w:rPr>
+          <w:rFonts w:ascii="Times New Roman" w:hAnsi="Times New Roman" w:cs="Times New Roman"/>
+        </w:rPr>
+        <w:t>.The model was trained on deblurred images, allowing it to learn object features from improved image quality .After training  the model was evaluated on the validation dataset using standard object detection metrics such as mean Average Precision(</w:t>
+      </w:r>
+      <w:proofErr w:type="spellStart"/>
+      <w:r>
+        <w:rPr>
+          <w:rFonts w:ascii="Times New Roman" w:hAnsi="Times New Roman" w:cs="Times New Roman"/>
+        </w:rPr>
+        <w:t>mAP</w:t>
+      </w:r>
+      <w:proofErr w:type="spellEnd"/>
+      <w:r>
+        <w:rPr>
+          <w:rFonts w:ascii="Times New Roman" w:hAnsi="Times New Roman" w:cs="Times New Roman"/>
+        </w:rPr>
+        <w:t>),precision and recall.</w:t>
+      </w:r>
+    </w:p>
+    <w:p>
+      <w:pPr>
+        <w:jc w:val="both"/>
+        <w:rPr>
+          <w:rFonts w:ascii="Times New Roman" w:hAnsi="Times New Roman" w:cs="Times New Roman"/>
+        </w:rPr>
+      </w:pPr>
+    </w:p>
+    <w:p>
+      <w:pPr>
+        <w:pStyle w:val="ListParagraph"/>
+        <w:numPr>
+          <w:ilvl w:val="1"/>
+          <w:numId w:val="1"/>
+        </w:numPr>
+        <w:ind w:left="360"/>
+        <w:jc w:val="both"/>
+        <w:rPr>
+          <w:rFonts w:ascii="Times New Roman" w:hAnsi="Times New Roman" w:cs="Times New Roman"/>
+          <w:b/>
+          <w:bCs/>
+        </w:rPr>
+      </w:pPr>
+      <w:r>
+        <w:rPr>
+          <w:rFonts w:ascii="Times New Roman" w:hAnsi="Times New Roman" w:cs="Times New Roman"/>
+          <w:b/>
+          <w:bCs/>
+        </w:rPr>
+        <w:t>Detection Performance</w:t>
+      </w:r>
+    </w:p>
+    <w:p>
+      <w:pPr>
+        <w:jc w:val="both"/>
+        <w:rPr>
+          <w:rFonts w:ascii="Times New Roman" w:hAnsi="Times New Roman" w:cs="Times New Roman"/>
+        </w:rPr>
+      </w:pPr>
+      <w:r>
+        <w:rPr>
+          <w:rFonts w:ascii="Times New Roman" w:hAnsi="Times New Roman" w:cs="Times New Roman"/>
+        </w:rPr>
+        <w:t xml:space="preserve">The trained model evaluated </w:t>
+      </w:r>
+      <w:proofErr w:type="gramStart"/>
+      <w:r>
+        <w:rPr>
+          <w:rFonts w:ascii="Times New Roman" w:hAnsi="Times New Roman" w:cs="Times New Roman"/>
+        </w:rPr>
+        <w:t xml:space="preserve">using </w:t>
+      </w:r>
+      <w:r>
+        <w:rPr>
+          <w:rFonts w:ascii="Times New Roman" w:hAnsi="Times New Roman" w:cs="Times New Roman"/>
+        </w:rPr>
+        <w:t xml:space="preserve"> </w:t>
+      </w:r>
+      <w:proofErr w:type="spellStart"/>
+      <w:r>
+        <w:rPr>
+          <w:rFonts w:ascii="Times New Roman" w:hAnsi="Times New Roman" w:cs="Times New Roman"/>
+        </w:rPr>
+        <w:t>mAP</w:t>
+      </w:r>
+      <w:proofErr w:type="spellEnd"/>
+      <w:proofErr w:type="gramEnd"/>
+      <w:r>
+        <w:rPr>
+          <w:rFonts w:ascii="Times New Roman" w:hAnsi="Times New Roman" w:cs="Times New Roman"/>
+        </w:rPr>
+        <w:t xml:space="preserve"> </w:t>
+      </w:r>
+      <w:proofErr w:type="gramStart"/>
+      <w:r>
+        <w:rPr>
+          <w:rFonts w:ascii="Times New Roman" w:hAnsi="Times New Roman" w:cs="Times New Roman"/>
+        </w:rPr>
+        <w:t>50 ,</w:t>
+      </w:r>
+      <w:proofErr w:type="gramEnd"/>
+      <w:r>
+        <w:rPr>
+          <w:rFonts w:ascii="Times New Roman" w:hAnsi="Times New Roman" w:cs="Times New Roman"/>
+        </w:rPr>
+        <w:t xml:space="preserve"> </w:t>
+      </w:r>
+      <w:proofErr w:type="spellStart"/>
+      <w:r>
+        <w:rPr>
+          <w:rFonts w:ascii="Times New Roman" w:hAnsi="Times New Roman" w:cs="Times New Roman"/>
+        </w:rPr>
+        <w:t>mAP</w:t>
+      </w:r>
+      <w:proofErr w:type="spellEnd"/>
+      <w:r>
+        <w:rPr>
+          <w:rFonts w:ascii="Times New Roman" w:hAnsi="Times New Roman" w:cs="Times New Roman"/>
+        </w:rPr>
+        <w:t xml:space="preserve"> 50-</w:t>
+      </w:r>
+      <w:proofErr w:type="gramStart"/>
+      <w:r>
+        <w:rPr>
+          <w:rFonts w:ascii="Times New Roman" w:hAnsi="Times New Roman" w:cs="Times New Roman"/>
+        </w:rPr>
+        <w:t>95 ,</w:t>
+      </w:r>
+      <w:proofErr w:type="gramEnd"/>
+      <w:r>
+        <w:rPr>
+          <w:rFonts w:ascii="Times New Roman" w:hAnsi="Times New Roman" w:cs="Times New Roman"/>
+        </w:rPr>
+        <w:t xml:space="preserve"> </w:t>
+      </w:r>
+      <w:r>
+        <w:rPr>
+          <w:rFonts w:ascii="Times New Roman" w:hAnsi="Times New Roman" w:cs="Times New Roman"/>
+        </w:rPr>
+        <w:t>precision and</w:t>
+      </w:r>
+      <w:r>
+        <w:rPr>
+          <w:rFonts w:ascii="Times New Roman" w:hAnsi="Times New Roman" w:cs="Times New Roman"/>
+        </w:rPr>
+        <w:t xml:space="preserve"> recall metrics. These metrics provide insight into the model’s ability to accurately detect and localize objects. The results indicate that training on deblurred images improves detection performance compared to blurred </w:t>
+      </w:r>
+      <w:proofErr w:type="gramStart"/>
+      <w:r>
+        <w:rPr>
+          <w:rFonts w:ascii="Times New Roman" w:hAnsi="Times New Roman" w:cs="Times New Roman"/>
+        </w:rPr>
+        <w:t>images .Clearer</w:t>
+      </w:r>
+      <w:proofErr w:type="gramEnd"/>
+      <w:r>
+        <w:rPr>
+          <w:rFonts w:ascii="Times New Roman" w:hAnsi="Times New Roman" w:cs="Times New Roman"/>
+        </w:rPr>
+        <w:t xml:space="preserve"> object boundaries </w:t>
+      </w:r>
+      <w:r>
+        <w:rPr>
+          <w:rFonts w:ascii="Times New Roman" w:hAnsi="Times New Roman" w:cs="Times New Roman"/>
+        </w:rPr>
+        <w:t>and reduced blur enable the model to achieve better localization and higher confidence scores.</w:t>
+      </w:r>
+      <w:r>
+        <w:rPr>
+          <w:rFonts w:ascii="Times New Roman" w:hAnsi="Times New Roman" w:cs="Times New Roman"/>
+        </w:rPr>
+        <w:t xml:space="preserve"> </w:t>
       </w:r>
     </w:p>
     <w:p>
@@ -1372,63 +2142,192 @@
         <w:rPr>
           <w:rFonts w:ascii="Times New Roman" w:hAnsi="Times New Roman" w:cs="Times New Roman"/>
         </w:rPr>
-        <w:t>The performance of the image restoration process was analyzed by comparing blurred, Weiner restored and ground truth sharp images using both visual and quantitative evaluation</w:t>
-      </w:r>
-      <w:r>
-        <w:rPr>
-          <w:rFonts w:ascii="Times New Roman" w:hAnsi="Times New Roman" w:cs="Times New Roman"/>
-        </w:rPr>
-        <w:t xml:space="preserve">. The Weiner </w:t>
-      </w:r>
-      <w:r>
-        <w:rPr>
-          <w:rFonts w:ascii="Times New Roman" w:hAnsi="Times New Roman" w:cs="Times New Roman"/>
+        <w:t xml:space="preserve">The performance of the image restoration process was analyzed by comparing blurred, </w:t>
+      </w:r>
+      <w:r>
+        <w:rPr>
+          <w:rFonts w:ascii="Times New Roman" w:hAnsi="Times New Roman" w:cs="Times New Roman"/>
+        </w:rPr>
+        <w:t>Wiener</w:t>
+      </w:r>
+      <w:r>
+        <w:rPr>
+          <w:rFonts w:ascii="Times New Roman" w:hAnsi="Times New Roman" w:cs="Times New Roman"/>
+        </w:rPr>
+        <w:t xml:space="preserve"> restored and ground truth sharp images using both visual and quantitative evaluation</w:t>
+      </w:r>
+      <w:r>
+        <w:rPr>
+          <w:rFonts w:ascii="Times New Roman" w:hAnsi="Times New Roman" w:cs="Times New Roman"/>
+        </w:rPr>
+        <w:t xml:space="preserve">. The </w:t>
+      </w:r>
+      <w:r>
+        <w:rPr>
+          <w:rFonts w:ascii="Times New Roman" w:hAnsi="Times New Roman" w:cs="Times New Roman"/>
+        </w:rPr>
+        <w:t>Wiener</w:t>
+      </w:r>
+      <w:r>
+        <w:rPr>
+          <w:rFonts w:ascii="Times New Roman" w:hAnsi="Times New Roman" w:cs="Times New Roman"/>
+        </w:rPr>
+        <w:t xml:space="preserve"> filter demonstrated </w:t>
+      </w:r>
+      <w:proofErr w:type="gramStart"/>
+      <w:r>
+        <w:rPr>
+          <w:rFonts w:ascii="Times New Roman" w:hAnsi="Times New Roman" w:cs="Times New Roman"/>
+        </w:rPr>
+        <w:t>noticeable</w:t>
+      </w:r>
+      <w:proofErr w:type="gramEnd"/>
+      <w:r>
+        <w:rPr>
+          <w:rFonts w:ascii="Times New Roman" w:hAnsi="Times New Roman" w:cs="Times New Roman"/>
+        </w:rPr>
+        <w:t xml:space="preserve"> improved over the blurred images by reducing motion blur and enhancing structural visibility. Object boundaries and major features became clearer after restoration, which is beneficial for computer vision tasks such as object detection. </w:t>
+      </w:r>
+      <w:proofErr w:type="gramStart"/>
+      <w:r>
+        <w:rPr>
+          <w:rFonts w:ascii="Times New Roman" w:hAnsi="Times New Roman" w:cs="Times New Roman"/>
+        </w:rPr>
+        <w:t>However</w:t>
+      </w:r>
+      <w:proofErr w:type="gramEnd"/>
+      <w:r>
+        <w:rPr>
+          <w:rFonts w:ascii="Times New Roman" w:hAnsi="Times New Roman" w:cs="Times New Roman"/>
+        </w:rPr>
+        <w:t xml:space="preserve"> the quantitative evaluation using PSNR revealed a relatively low value of approximately 9.5db. This indicates that although the restored image appears visually improved, it still </w:t>
+      </w:r>
+      <w:proofErr w:type="gramStart"/>
+      <w:r>
+        <w:rPr>
+          <w:rFonts w:ascii="Times New Roman" w:hAnsi="Times New Roman" w:cs="Times New Roman"/>
+        </w:rPr>
+        <w:t>differs  significantly</w:t>
+      </w:r>
+      <w:proofErr w:type="gramEnd"/>
+      <w:r>
+        <w:rPr>
+          <w:rFonts w:ascii="Times New Roman" w:hAnsi="Times New Roman" w:cs="Times New Roman"/>
+        </w:rPr>
+        <w:t xml:space="preserve">  from the original sharp image at the pixel level. The highlights a key limitation of classical deblurring techniques where perceptual enhancement does not necessarily correspond to high numerical accuracy.</w:t>
+      </w:r>
+    </w:p>
+    <w:p>
+      <w:pPr>
+        <w:jc w:val="both"/>
+        <w:rPr>
+          <w:rFonts w:ascii="Times New Roman" w:hAnsi="Times New Roman" w:cs="Times New Roman"/>
+        </w:rPr>
+      </w:pPr>
+      <w:r>
+        <w:rPr>
+          <w:rFonts w:ascii="Times New Roman" w:hAnsi="Times New Roman" w:cs="Times New Roman"/>
+        </w:rPr>
+        <w:t>To further evaluate the effect of deblurring on object detection, the average detection confidence scores were compared across blurred and sharp images.</w:t>
+      </w:r>
+    </w:p>
+    <w:p>
+      <w:pPr>
+        <w:jc w:val="both"/>
+        <w:rPr>
+          <w:rFonts w:ascii="Times New Roman" w:hAnsi="Times New Roman" w:cs="Times New Roman"/>
+        </w:rPr>
+      </w:pPr>
+      <w:r>
+        <w:rPr>
+          <w:rFonts w:ascii="Times New Roman" w:hAnsi="Times New Roman" w:cs="Times New Roman"/>
+          <w:noProof/>
         </w:rPr>
         <w:lastRenderedPageBreak/>
-        <w:t xml:space="preserve">filter demonstrated noticeable </w:t>
+        <w:drawing>
+          <wp:inline distT="0" distB="0" distL="0" distR="0" wp14:anchorId="4B65CBB2" wp14:editId="1B444CD9">
+            <wp:extent cx="5604647" cy="3145536"/>
+            <wp:effectExtent l="0" t="0" r="0" b="0"/>
+            <wp:docPr id="1094651992" name="Picture 2"/>
+            <wp:cNvGraphicFramePr>
+              <a:graphicFrameLocks xmlns:a="http://schemas.openxmlformats.org/drawingml/2006/main" noChangeAspect="1"/>
+            </wp:cNvGraphicFramePr>
+            <a:graphic xmlns:a="http://schemas.openxmlformats.org/drawingml/2006/main">
+              <a:graphicData uri="http://schemas.openxmlformats.org/drawingml/2006/picture">
+                <pic:pic xmlns:pic="http://schemas.openxmlformats.org/drawingml/2006/picture">
+                  <pic:nvPicPr>
+                    <pic:cNvPr id="1094651992" name="Picture 1094651992"/>
+                    <pic:cNvPicPr/>
+                  </pic:nvPicPr>
+                  <pic:blipFill>
+                    <a:blip r:embed="rId10">
+                      <a:extLst>
+                        <a:ext uri="{28A0092B-C50C-407E-A947-70E740481C1C}">
+                          <a14:useLocalDpi xmlns:a14="http://schemas.microsoft.com/office/drawing/2010/main" val="0"/>
+                        </a:ext>
+                      </a:extLst>
+                    </a:blip>
+                    <a:stretch>
+                      <a:fillRect/>
+                    </a:stretch>
+                  </pic:blipFill>
+                  <pic:spPr>
+                    <a:xfrm>
+                      <a:off x="0" y="0"/>
+                      <a:ext cx="5646775" cy="3169180"/>
+                    </a:xfrm>
+                    <a:prstGeom prst="rect">
+                      <a:avLst/>
+                    </a:prstGeom>
+                  </pic:spPr>
+                </pic:pic>
+              </a:graphicData>
+            </a:graphic>
+          </wp:inline>
+        </w:drawing>
+      </w:r>
+    </w:p>
+    <w:p>
+      <w:pPr>
+        <w:jc w:val="both"/>
+        <w:rPr>
+          <w:rFonts w:ascii="Times New Roman" w:hAnsi="Times New Roman" w:cs="Times New Roman"/>
+        </w:rPr>
+      </w:pPr>
+      <w:r>
+        <w:rPr>
+          <w:rFonts w:ascii="Times New Roman" w:hAnsi="Times New Roman" w:cs="Times New Roman"/>
+        </w:rPr>
+        <w:t>The results show that deblurred images achieve higher detection confidence compared to both blurred and sharp images. This indicates that the restoration process enhances structural features such as edges and object boundaries making them more distinguishable for the detection model. The confidence score</w:t>
+      </w:r>
+      <w:r>
+        <w:rPr>
+          <w:rFonts w:ascii="Times New Roman" w:hAnsi="Times New Roman" w:cs="Times New Roman"/>
+        </w:rPr>
+        <w:t xml:space="preserve"> for sharp images is slightly lower than for deblurred </w:t>
       </w:r>
       <w:proofErr w:type="gramStart"/>
       <w:r>
         <w:rPr>
           <w:rFonts w:ascii="Times New Roman" w:hAnsi="Times New Roman" w:cs="Times New Roman"/>
         </w:rPr>
-        <w:t>improved</w:t>
+        <w:t>images .</w:t>
       </w:r>
       <w:proofErr w:type="gramEnd"/>
       <w:r>
         <w:rPr>
           <w:rFonts w:ascii="Times New Roman" w:hAnsi="Times New Roman" w:cs="Times New Roman"/>
         </w:rPr>
-        <w:t xml:space="preserve"> over the blurred images by reducing motion blur and enhancing structural visibility. Object boundaries and major features became clearer after restoration, which is beneficial for computer vision tasks such as object detection. </w:t>
-      </w:r>
-      <w:proofErr w:type="gramStart"/>
-      <w:r>
-        <w:rPr>
-          <w:rFonts w:ascii="Times New Roman" w:hAnsi="Times New Roman" w:cs="Times New Roman"/>
-        </w:rPr>
-        <w:t>However</w:t>
-      </w:r>
-      <w:proofErr w:type="gramEnd"/>
-      <w:r>
-        <w:rPr>
-          <w:rFonts w:ascii="Times New Roman" w:hAnsi="Times New Roman" w:cs="Times New Roman"/>
-        </w:rPr>
-        <w:t xml:space="preserve"> the quantitative evaluation using PSNR revealed a relatively low value of approximately 9.5db. This indicates that although the restored image appears visually improved, it still </w:t>
-      </w:r>
-      <w:proofErr w:type="gramStart"/>
-      <w:r>
-        <w:rPr>
-          <w:rFonts w:ascii="Times New Roman" w:hAnsi="Times New Roman" w:cs="Times New Roman"/>
-        </w:rPr>
-        <w:t>differs  significantly</w:t>
-      </w:r>
-      <w:proofErr w:type="gramEnd"/>
-      <w:r>
-        <w:rPr>
-          <w:rFonts w:ascii="Times New Roman" w:hAnsi="Times New Roman" w:cs="Times New Roman"/>
-        </w:rPr>
-        <w:t xml:space="preserve">  from the original sharp image at the pixel level. The highlights a key limitation of classical deblurring techniques where perceptual enhancement does not necessarily correspond to high numerical accuracy.</w:t>
-      </w:r>
+        <w:t xml:space="preserve"> This may be due to differences in data distribution or the model being more adapted to restored image during the training.</w:t>
+      </w:r>
+    </w:p>
+    <w:p>
+      <w:pPr>
+        <w:jc w:val="both"/>
+        <w:rPr>
+          <w:rFonts w:ascii="Times New Roman" w:hAnsi="Times New Roman" w:cs="Times New Roman"/>
+        </w:rPr>
+      </w:pPr>
     </w:p>
     <w:p>
       <w:pPr>
@@ -1615,24 +2514,37 @@
         <w:rPr>
           <w:rFonts w:ascii="Times New Roman" w:hAnsi="Times New Roman" w:cs="Times New Roman"/>
         </w:rPr>
-        <w:t xml:space="preserve"> making it suitable for real time applications. However, this efficiency comes at the cost of reduced sharpness and detail recovery compared to more advanced or iterative methods. While the Weiner filter provides stable and fast results it may not fully reconstruct fine image details.</w:t>
-      </w:r>
-    </w:p>
-    <w:p>
-      <w:pPr>
-        <w:jc w:val="both"/>
-        <w:rPr>
-          <w:rFonts w:ascii="Times New Roman" w:hAnsi="Times New Roman" w:cs="Times New Roman"/>
-          <w:b/>
-          <w:bCs/>
-        </w:rPr>
-      </w:pPr>
-      <w:r>
-        <w:rPr>
-          <w:rFonts w:ascii="Times New Roman" w:hAnsi="Times New Roman" w:cs="Times New Roman"/>
-          <w:b/>
-          <w:bCs/>
-        </w:rPr>
+        <w:t xml:space="preserve"> making it suitable for real time applications. However, this efficiency comes at the cost of reduced sharpness and detail recovery compared to more advanced or iterative methods. While the </w:t>
+      </w:r>
+      <w:r>
+        <w:rPr>
+          <w:rFonts w:ascii="Times New Roman" w:hAnsi="Times New Roman" w:cs="Times New Roman"/>
+        </w:rPr>
+        <w:t>Wiener</w:t>
+      </w:r>
+      <w:r>
+        <w:rPr>
+          <w:rFonts w:ascii="Times New Roman" w:hAnsi="Times New Roman" w:cs="Times New Roman"/>
+        </w:rPr>
+        <w:t xml:space="preserve"> filter provides stable and fast results it may not fully reconstruct fine image details.</w:t>
+      </w:r>
+    </w:p>
+    <w:p>
+      <w:pPr>
+        <w:jc w:val="both"/>
+        <w:rPr>
+          <w:rFonts w:ascii="Times New Roman" w:hAnsi="Times New Roman" w:cs="Times New Roman"/>
+          <w:b/>
+          <w:bCs/>
+        </w:rPr>
+      </w:pPr>
+      <w:r>
+        <w:rPr>
+          <w:rFonts w:ascii="Times New Roman" w:hAnsi="Times New Roman" w:cs="Times New Roman"/>
+          <w:b/>
+          <w:bCs/>
+        </w:rPr>
+        <w:lastRenderedPageBreak/>
         <w:t xml:space="preserve">5.3 Implications for Object Detection </w:t>
       </w:r>
     </w:p>
@@ -1792,7 +2704,19 @@
         <w:rPr>
           <w:rFonts w:ascii="Times New Roman" w:hAnsi="Times New Roman" w:cs="Times New Roman"/>
         </w:rPr>
-        <w:t xml:space="preserve"> optimizing the blur kernel estimation and tuning the Weiner filter parameters could further improve restoration quality.</w:t>
+        <w:t xml:space="preserve"> optimizing the blur kernel estimation and tuning the </w:t>
+      </w:r>
+      <w:r>
+        <w:rPr>
+          <w:rFonts w:ascii="Times New Roman" w:hAnsi="Times New Roman" w:cs="Times New Roman"/>
+        </w:rPr>
+        <w:t>Wiener</w:t>
+      </w:r>
+      <w:r>
+        <w:rPr>
+          <w:rFonts w:ascii="Times New Roman" w:hAnsi="Times New Roman" w:cs="Times New Roman"/>
+        </w:rPr>
+        <w:t xml:space="preserve"> filter parameters could further improve restoration quality.</w:t>
       </w:r>
     </w:p>
     <w:p>
@@ -1825,26 +2749,23 @@
           <w:szCs w:val="28"/>
           <w:u w:val="single"/>
         </w:rPr>
-        <w:lastRenderedPageBreak/>
         <w:t xml:space="preserve">6.References </w:t>
       </w:r>
     </w:p>
     <w:sdt>
       <w:sdtPr>
+        <w:rPr>
+          <w:rFonts w:asciiTheme="minorHAnsi" w:eastAsiaTheme="minorHAnsi" w:hAnsiTheme="minorHAnsi" w:cstheme="minorBidi"/>
+          <w:color w:val="auto"/>
+          <w:sz w:val="24"/>
+          <w:szCs w:val="24"/>
+        </w:rPr>
         <w:id w:val="52283943"/>
         <w:docPartObj>
           <w:docPartGallery w:val="Bibliographies"/>
           <w:docPartUnique/>
         </w:docPartObj>
       </w:sdtPr>
-      <w:sdtEndPr>
-        <w:rPr>
-          <w:rFonts w:asciiTheme="minorHAnsi" w:eastAsiaTheme="minorHAnsi" w:hAnsiTheme="minorHAnsi" w:cstheme="minorBidi"/>
-          <w:color w:val="auto"/>
-          <w:sz w:val="24"/>
-          <w:szCs w:val="24"/>
-        </w:rPr>
-      </w:sdtEndPr>
       <w:sdtContent>
         <w:p>
           <w:pPr>
@@ -2161,6 +3082,7 @@
                   <w:rFonts w:ascii="Times New Roman" w:hAnsi="Times New Roman" w:cs="Times New Roman"/>
                   <w:noProof/>
                 </w:rPr>
+                <w:lastRenderedPageBreak/>
                 <w:t xml:space="preserve">9.Wang, Z., Bovik, A. C., Sheikh, H. R. &amp; Simoncelli, E. P., 2004. Image Quality Assessment: From Error Visibility to Structural Similarity. </w:t>
               </w:r>
               <w:r>

</xml_diff>